<commit_message>
design v3: show the classification only in the page header, not above the cover title (#209)
The header's STYLEREF field still reads the cover's Cover Classification
paragraph. v3's reference documents now print that paragraph invisibly
(white, 1pt, no spacing). It is not hidden, because STYLEREF shows blank
for hidden text. The header field gains \* CHARFORMAT so its result keeps
the Header Classification formatting.

Co-Authored-By: Claude Opus 5.5 (1M context) <noreply@anthropic.com>
Claude-Session: https://claude.ai/code/session_01LrNCncL34ZyXuzh2EA4G2N
</commit_message>
<xml_diff>
--- a/definitions/design/3/templates/reference-as-built.docx
+++ b/definitions/design/3/templates/reference-as-built.docx
@@ -2953,7 +2953,7 @@
       <w:fldChar w:fldCharType="begin"/>
     </w:r>
     <w:r>
-      <w:instrText xml:space="preserve"> STYLEREF "Cover Classification" </w:instrText>
+      <w:instrText xml:space="preserve"> STYLEREF "Cover Classification" \* CHARFORMAT </w:instrText>
     </w:r>
     <w:r>
       <w:fldChar w:fldCharType="separate"/>
@@ -3332,7 +3332,7 @@
       <w:fldChar w:fldCharType="begin"/>
     </w:r>
     <w:r>
-      <w:instrText xml:space="preserve"> STYLEREF "Cover Classification" </w:instrText>
+      <w:instrText xml:space="preserve"> STYLEREF "Cover Classification" \* CHARFORMAT </w:instrText>
     </w:r>
     <w:r>
       <w:fldChar w:fldCharType="separate"/>
@@ -3558,7 +3558,7 @@
       <w:fldChar w:fldCharType="begin"/>
     </w:r>
     <w:r>
-      <w:instrText xml:space="preserve"> STYLEREF "Cover Classification" </w:instrText>
+      <w:instrText xml:space="preserve"> STYLEREF "Cover Classification" \* CHARFORMAT </w:instrText>
     </w:r>
     <w:r>
       <w:fldChar w:fldCharType="separate"/>
@@ -23353,6 +23353,21 @@
       <w:vertAlign w:val="superscript"/>
     </w:rPr>
   </w:style>
+  <w:style w:type="paragraph" w:customStyle="1" w:styleId="CoverClassification">
+    <w:name w:val="Cover Classification"/>
+    <w:basedOn w:val="Normal"/>
+    <w:next w:val="Normal"/>
+    <w:uiPriority w:val="99"/>
+    <w:qFormat/>
+    <w:pPr>
+      <w:spacing w:before="0" w:after="0" w:line="20" w:lineRule="exact"/>
+    </w:pPr>
+    <w:rPr>
+      <w:color w:val="FFFFFF"/>
+      <w:sz w:val="2"/>
+      <w:szCs w:val="2"/>
+    </w:rPr>
+  </w:style>
 </w:styles>
 </file>
 

</xml_diff>